<commit_message>
Refactor code structure and remove redundant sections for improved readability and maintainability
</commit_message>
<xml_diff>
--- a/tailored_resume/rajendra-prasad-n/Rajendra-AWS-DevOps-SRE-Terraform.docx
+++ b/tailored_resume/rajendra-prasad-n/Rajendra-AWS-DevOps-SRE-Terraform.docx
@@ -139,7 +139,7 @@
         <w:spacing w:before="160"/>
       </w:pPr>
       <w:r>
-        <w:t>Lead DevOps Engineer with 13+ years of overall IT experience, including 10+ years in DevOps, cloud engineering, and production operations. Builds AWS infrastructure, reusable Terraform modules, GitHub Actions delivery workflows, and Kubernetes platforms. Combines Python/Bash automation, GitOps, secure IAM access, cloud observability, incident troubleshooting, and recovery readiness. Brings Azure delivery experience and GCP architecture knowledge alongside an AWS-focused engineering background. Evaluates observability-as-code and platform self-service patterns for standardized infrastructure and monitoring delivery.</w:t>
+        <w:t>Lead DevOps Engineer with 10 years of experience in DevOps, cloud engineering, and production operations. Builds AWS infrastructure, reusable Terraform modules, GitHub Actions delivery workflows, and Kubernetes platforms. Combines Python/Bash automation, GitOps, secure IAM access, cloud observability, incident troubleshooting, and recovery readiness. Brings Azure delivery experience and GCP architecture knowledge alongside an AWS-focused engineering background. Evaluates observability-as-code and platform self-service patterns for standardized infrastructure and monitoring delivery.</w:t>
       </w:r>
     </w:p>
     <w:p>
@@ -1445,124 +1445,6 @@
     </w:p>
     <w:p>
       <w:pPr>
-        <w:keepNext/>
-        <w:tabs>
-          <w:tab w:pos="10318" w:val="right"/>
-        </w:tabs>
-        <w:spacing w:before="140"/>
-      </w:pPr>
-      <w:r>
-        <w:rPr>
-          <w:b/>
-          <w:sz w:val="20"/>
-        </w:rPr>
-        <w:t>Build &amp; Release Engineer | Calin Infotech</w:t>
-      </w:r>
-      <w:r>
-        <w:rPr>
-          <w:b w:val="0"/>
-          <w:sz w:val="16"/>
-        </w:rPr>
-        <w:tab/>
-        <w:t>08/2013 - 08/2016</w:t>
-      </w:r>
-    </w:p>
-    <w:p>
-      <w:pPr>
-        <w:keepNext/>
-      </w:pPr>
-      <w:r>
-        <w:rPr>
-          <w:b/>
-          <w:sz w:val="16"/>
-        </w:rPr>
-        <w:t xml:space="preserve">Project: </w:t>
-      </w:r>
-      <w:r>
-        <w:rPr>
-          <w:b w:val="0"/>
-          <w:sz w:val="16"/>
-        </w:rPr>
-        <w:t>Expedia Travel Portal</w:t>
-      </w:r>
-    </w:p>
-    <w:p>
-      <w:pPr>
-        <w:keepNext/>
-      </w:pPr>
-      <w:r>
-        <w:rPr>
-          <w:b/>
-          <w:sz w:val="16"/>
-        </w:rPr>
-        <w:t xml:space="preserve">Skills Used: </w:t>
-      </w:r>
-      <w:r>
-        <w:rPr>
-          <w:b w:val="0"/>
-          <w:sz w:val="16"/>
-        </w:rPr>
-        <w:t>Build &amp; Release, Shell Scripting, Linux, Source Control, Application Deployment</w:t>
-      </w:r>
-    </w:p>
-    <w:p>
-      <w:pPr>
-        <w:pStyle w:val="ListBullet"/>
-        <w:keepLines/>
-        <w:spacing w:after="40"/>
-        <w:ind w:left="227" w:hanging="170"/>
-      </w:pPr>
-      <w:r>
-        <w:rPr>
-          <w:b w:val="0"/>
-        </w:rPr>
-        <w:t>Maintained version-controlled build configurations and release documentation, tracking artifact versions and environment-specific settings.</w:t>
-      </w:r>
-    </w:p>
-    <w:p>
-      <w:pPr>
-        <w:pStyle w:val="ListBullet"/>
-        <w:keepLines/>
-        <w:spacing w:after="40"/>
-        <w:ind w:left="227" w:hanging="170"/>
-      </w:pPr>
-      <w:r>
-        <w:rPr>
-          <w:b w:val="0"/>
-        </w:rPr>
-        <w:t>Supported application builds, release packaging, and deployment coordination for the Expedia Travel Portal across development and test environments.</w:t>
-      </w:r>
-    </w:p>
-    <w:p>
-      <w:pPr>
-        <w:pStyle w:val="ListBullet"/>
-        <w:keepLines/>
-        <w:spacing w:after="40"/>
-        <w:ind w:left="227" w:hanging="170"/>
-      </w:pPr>
-      <w:r>
-        <w:rPr>
-          <w:b w:val="0"/>
-        </w:rPr>
-        <w:t>Prepared shell scripts for deployment preparation, configuration checks, and log collection to simplify recurring release support tasks.</w:t>
-      </w:r>
-    </w:p>
-    <w:p>
-      <w:pPr>
-        <w:pStyle w:val="ListBullet"/>
-        <w:keepLines/>
-        <w:spacing w:after="40"/>
-        <w:ind w:left="227" w:hanging="170"/>
-      </w:pPr>
-      <w:r>
-        <w:rPr>
-          <w:b w:val="0"/>
-        </w:rPr>
-        <w:t>Partnered with developers and QA to investigate build and deployment failures, verify application smoke tests, and support release handovers.</w:t>
-      </w:r>
-    </w:p>
-    <w:p>
-      <w:pPr>
         <w:pStyle w:val="Heading1"/>
       </w:pPr>
       <w:r>

</xml_diff>